<commit_message>
Remove author placeholder and refresh Kindle listing metadata
</commit_message>
<xml_diff>
--- a/deliverables/Amazon_KDP_Listing.docx
+++ b/deliverables/Amazon_KDP_Listing.docx
@@ -148,7 +148,7 @@
         <w:pStyle w:val="ListNumber"/>
       </w:pPr>
       <w:r>
-        <w:t>AI side hustle for beginners</w:t>
+        <w:t>AI content creation workflow</w:t>
       </w:r>
     </w:p>
     <w:p>
@@ -156,7 +156,7 @@
         <w:pStyle w:val="ListNumber"/>
       </w:pPr>
       <w:r>
-        <w:t>make money with ChatGPT</w:t>
+        <w:t>freelance social media services</w:t>
       </w:r>
     </w:p>
     <w:p>
@@ -164,7 +164,7 @@
         <w:pStyle w:val="ListNumber"/>
       </w:pPr>
       <w:r>
-        <w:t>social media business ideas</w:t>
+        <w:t>small business content calendar</w:t>
       </w:r>
     </w:p>
     <w:p>
@@ -172,7 +172,7 @@
         <w:pStyle w:val="ListNumber"/>
       </w:pPr>
       <w:r>
-        <w:t>social media management for small business</w:t>
+        <w:t>short form video editing services</w:t>
       </w:r>
     </w:p>
     <w:p>
@@ -180,7 +180,7 @@
         <w:pStyle w:val="ListNumber"/>
       </w:pPr>
       <w:r>
-        <w:t>short form video editing business</w:t>
+        <w:t>YouTube channel monetization guide</w:t>
       </w:r>
     </w:p>
     <w:p>
@@ -188,7 +188,7 @@
         <w:pStyle w:val="ListNumber"/>
       </w:pPr>
       <w:r>
-        <w:t>digital products and affiliate marketing</w:t>
+        <w:t>create and sell digital downloads</w:t>
       </w:r>
     </w:p>
     <w:p>
@@ -196,7 +196,7 @@
         <w:pStyle w:val="ListNumber"/>
       </w:pPr>
       <w:r>
-        <w:t>YouTube channel business for beginners</w:t>
+        <w:t>beginner affiliate content marketing</w:t>
       </w:r>
     </w:p>
     <w:p>
@@ -211,7 +211,7 @@
     <w:p>
       <w:pPr/>
       <w:r>
-        <w:t>Choose the closest current KDP categories available in the Bookshelf interface. Candidate areas: Business &amp; Money &gt; Entrepreneurship; Business &amp; Money &gt; Small Business &amp; Entrepreneurship; Computers &amp; Technology &gt; Computer Science &gt; Artificial Intelligence (select only if the taxonomy offers a suitable practical guide category). Category names and selection limits can change; confirm in KDP before submission.</w:t>
+        <w:t>Choose up to three accurate categories from the current KDP selector for the Amazon.com marketplace. Suggested areas: Business &amp; Money &gt; Entrepreneurship; Business &amp; Money &gt; Small Business &amp; Entrepreneurship; Computers &amp; Technology &gt; Computer Science &gt; Artificial Intelligence, only if it offers a suitable practical business guide category. If not, select a relevant Marketing category. Confirm exact names and availability in KDP.</w:t>
       </w:r>
     </w:p>
     <w:p>
@@ -226,7 +226,7 @@
     <w:p>
       <w:pPr/>
       <w:r>
-        <w:t>For a professionally edited practical guide with reusable worksheets, a reasonable launch test is US$4.99–US$6.99 for the Kindle edition, with the final choice based on manuscript length, cover quality, competitor pricing, and KDP marketplace rules. A $5.99 starting point balances an accessible price with the book’s substantial templates and current research. This is a recommendation, not a guarantee of sales or royalty; verify current royalty eligibility, delivery fees, territorial prices, taxes, and promotions in KDP. Do not claim or imply a bestseller outcome.</w:t>
+        <w:t>Recommended launch test: US$5.99 on Amazon.com. As of October 27, 2026, this is within KDP’s listed $2.99–$12.99 U.S. price band for the 70% royalty option. The 70% option applies only to eligible sales and royalties are reduced by applicable VAT and delivery costs. Confirm current eligibility, delivery estimates, and converted territory prices on the live KDP Pricing page before publishing. The price is a recommendation, not a sales or earnings promise.</w:t>
       </w:r>
     </w:p>
     <w:sectPr>

</xml_diff>

<commit_message>
Add complete Kindle setup metadata and AI disclosure guidance
</commit_message>
<xml_diff>
--- a/deliverables/Amazon_KDP_Listing.docx
+++ b/deliverables/Amazon_KDP_Listing.docx
@@ -227,6 +227,124 @@
       <w:pPr/>
       <w:r>
         <w:t>Recommended launch test: US$5.99 on Amazon.com. As of October 27, 2026, this is within KDP’s listed $2.99–$12.99 U.S. price band for the 70% royalty option. The 70% option applies only to eligible sales and royalties are reduced by applicable VAT and delivery costs. Confirm current eligibility, delivery estimates, and converted territory prices on the live KDP Pricing page before publishing. The price is a recommendation, not a sales or earnings promise.</w:t>
+      </w:r>
+    </w:p>
+    <w:p>
+      <w:pPr>
+        <w:pStyle w:val="Heading2"/>
+      </w:pPr>
+      <w:r>
+        <w:t>Additional Kindle setup fields</w:t>
+      </w:r>
+    </w:p>
+    <w:p>
+      <w:r>
+        <w:rPr>
+          <w:b/>
+        </w:rPr>
+        <w:t xml:space="preserve">Author: </w:t>
+      </w:r>
+      <w:r>
+        <w:t>Jaspal Singh.</w:t>
+      </w:r>
+    </w:p>
+    <w:p>
+      <w:r>
+        <w:rPr>
+          <w:b/>
+        </w:rPr>
+        <w:t xml:space="preserve">Language: </w:t>
+      </w:r>
+      <w:r>
+        <w:t>English.</w:t>
+      </w:r>
+    </w:p>
+    <w:p>
+      <w:r>
+        <w:rPr>
+          <w:b/>
+        </w:rPr>
+        <w:t xml:space="preserve">Primary marketplace: </w:t>
+      </w:r>
+      <w:r>
+        <w:t>Amazon.com (United States). Set this to the store where you expect most sales; review converted prices for other marketplaces.</w:t>
+      </w:r>
+    </w:p>
+    <w:p>
+      <w:r>
+        <w:rPr>
+          <w:b/>
+        </w:rPr>
+        <w:t xml:space="preserve">Series: </w:t>
+      </w:r>
+      <w:r>
+        <w:t>None.</w:t>
+      </w:r>
+    </w:p>
+    <w:p>
+      <w:r>
+        <w:rPr>
+          <w:b/>
+        </w:rPr>
+        <w:t xml:space="preserve">Contributors: </w:t>
+      </w:r>
+      <w:r>
+        <w:t>None unless another person made a material contribution that should be credited.</w:t>
+      </w:r>
+    </w:p>
+    <w:p>
+      <w:r>
+        <w:rPr>
+          <w:b/>
+        </w:rPr>
+        <w:t xml:space="preserve">Reading age: </w:t>
+      </w:r>
+      <w:r>
+        <w:t>This is an adult/general-audience business guide, not a children’s book.</w:t>
+      </w:r>
+    </w:p>
+    <w:p>
+      <w:r>
+        <w:rPr>
+          <w:b/>
+        </w:rPr>
+        <w:t xml:space="preserve">KDP AI content disclosure: </w:t>
+      </w:r>
+      <w:r>
+        <w:t>Select Yes for AI-generated text and images. The manuscript and chosen cover include AI-generated content. KDP says AI-generated material must be disclosed even if substantially edited; AI-assisted editing alone does not require disclosure.</w:t>
+      </w:r>
+    </w:p>
+    <w:p>
+      <w:r>
+        <w:rPr>
+          <w:b/>
+        </w:rPr>
+        <w:t xml:space="preserve">Publishing rights: </w:t>
+      </w:r>
+      <w:r>
+        <w:t>Select the option confirming that you own or control the publishing rights only after verifying rights to all text, images, and other included material.</w:t>
+      </w:r>
+    </w:p>
+    <w:p>
+      <w:r>
+        <w:rPr>
+          <w:b/>
+        </w:rPr>
+        <w:t xml:space="preserve">ISBN: </w:t>
+      </w:r>
+      <w:r>
+        <w:t>Not required for a Kindle eBook.</w:t>
+      </w:r>
+    </w:p>
+    <w:p>
+      <w:r>
+        <w:rPr>
+          <w:b/>
+        </w:rPr>
+        <w:t xml:space="preserve">Publication date: </w:t>
+      </w:r>
+      <w:r>
+        <w:t>Enter your intended publication date in KDP; none is assumed here.</w:t>
       </w:r>
     </w:p>
     <w:sectPr>

</xml_diff>

<commit_message>
Clarify KDP Select exclusivity and India royalty eligibility
</commit_message>
<xml_diff>
--- a/deliverables/Amazon_KDP_Listing.docx
+++ b/deliverables/Amazon_KDP_Listing.docx
@@ -347,6 +347,17 @@
         <w:t>Enter your intended publication date in KDP; none is assumed here.</w:t>
       </w:r>
     </w:p>
+    <w:p>
+      <w:r>
+        <w:rPr>
+          <w:b/>
+        </w:rPr>
+        <w:t xml:space="preserve">KDP Select: </w:t>
+      </w:r>
+      <w:r>
+        <w:t>Optional. For sales to customers in India, the 70% royalty option requires KDP Select and the applicable local price requirements. KDP Select requires Kindle eBook exclusivity during each 90-day enrollment period. Enroll only if that restriction fits your distribution plans.</w:t>
+      </w:r>
+    </w:p>
     <w:sectPr>
       <w:headerReference w:type="default" r:id="rId9"/>
       <w:footerReference w:type="default" r:id="rId10"/>

</xml_diff>

<commit_message>
Refine KDP discovery keywords
</commit_message>
<xml_diff>
--- a/deliverables/Amazon_KDP_Listing.docx
+++ b/deliverables/Amazon_KDP_Listing.docx
@@ -148,7 +148,7 @@
         <w:pStyle w:val="ListNumber"/>
       </w:pPr>
       <w:r>
-        <w:t>AI content creation workflow</w:t>
+        <w:t>ChatGPT content prompts for small business</w:t>
       </w:r>
     </w:p>
     <w:p>
@@ -156,7 +156,7 @@
         <w:pStyle w:val="ListNumber"/>
       </w:pPr>
       <w:r>
-        <w:t>freelance social media services</w:t>
+        <w:t>freelance content creation business</w:t>
       </w:r>
     </w:p>
     <w:p>
@@ -164,7 +164,7 @@
         <w:pStyle w:val="ListNumber"/>
       </w:pPr>
       <w:r>
-        <w:t>small business content calendar</w:t>
+        <w:t>local business content calendar</w:t>
       </w:r>
     </w:p>
     <w:p>
@@ -172,7 +172,7 @@
         <w:pStyle w:val="ListNumber"/>
       </w:pPr>
       <w:r>
-        <w:t>short form video editing services</w:t>
+        <w:t>short form video editing service</w:t>
       </w:r>
     </w:p>
     <w:p>
@@ -188,7 +188,7 @@
         <w:pStyle w:val="ListNumber"/>
       </w:pPr>
       <w:r>
-        <w:t>create and sell digital downloads</w:t>
+        <w:t>sell digital downloads online</w:t>
       </w:r>
     </w:p>
     <w:p>
@@ -196,7 +196,7 @@
         <w:pStyle w:val="ListNumber"/>
       </w:pPr>
       <w:r>
-        <w:t>beginner affiliate content marketing</w:t>
+        <w:t>affiliate marketing content strategy</w:t>
       </w:r>
     </w:p>
     <w:p>

</xml_diff>